<commit_message>
Complete Week 3 review extensions and submission artifacts
</commit_message>
<xml_diff>
--- a/docs/Engineering Issue Desk Week 3 Demo Guide.docx
+++ b/docs/Engineering Issue Desk Week 3 Demo Guide.docx
@@ -17,12 +17,14 @@
       <w:r>
         <w:t>Naresh Ganji</w:t>
         <w:br/>
+        <w:t>October 25 2026</w:t>
+        <w:br/>
         <w:t>Four minutes and forty five seconds</w:t>
       </w:r>
     </w:p>
     <w:p>
       <w:r>
-        <w:t>Record a concise walkthrough of the working investigation and human review flow. The target runtime is 4 minutes 45 seconds, leaving 15 seconds below the handout's five minute limit. This is a recording script and preparation guide; it does not claim a video has already been recorded.</w:t>
+        <w:t>Use this guide to record the Week 3 demo. No video has been recorded yet. The sequence targets 4 minutes 45 seconds, leaving 15 seconds below the handout limit; demonstrate a genuine final-app interaction and identify any previously saved case visibly.</w:t>
       </w:r>
     </w:p>
     <w:p>
@@ -30,7 +32,7 @@
         <w:pStyle w:val="Heading1"/>
       </w:pPr>
       <w:r>
-        <w:t>Before recording</w:t>
+        <w:t>Prepare the recording</w:t>
       </w:r>
     </w:p>
     <w:p>
@@ -38,7 +40,7 @@
         <w:pStyle w:val="ListBullet"/>
       </w:pPr>
       <w:r>
-        <w:t>Start the Streamlit app and confirm the Deep Investigation tab can open. Keep credentials and .env outside the recording surface.</w:t>
+        <w:t>Run the local app, check the microphone, and use readable zoom. Keep .env, account panels, private history, and credentials outside the recording surface.</w:t>
       </w:r>
     </w:p>
     <w:p>
@@ -46,7 +48,7 @@
         <w:pStyle w:val="ListBullet"/>
       </w:pPr>
       <w:r>
-        <w:t>Choose a small public issue question. Have one previously recorded real case ready as a latency fallback, with its actual date, findings, and review state visible.</w:t>
+        <w:t>Open the current evaluation JSON by its explicit path and the Project guide diagram. The October 17 corpus is a dated snapshot; acknowledge any age warning.</w:t>
       </w:r>
     </w:p>
     <w:p>
@@ -54,7 +56,7 @@
         <w:pStyle w:val="ListBullet"/>
       </w:pPr>
       <w:r>
-        <w:t>Open the architecture diagram and recorded Week 3 results in separate tabs. Use a readable zoom level and test the microphone.</w:t>
+        <w:t>Choose a small real-code case with its source visible. Have a genuine saved case ID ready for latency fallback. Recheck its current report and review state before recording; do not assume a retained claim is correct.</w:t>
       </w:r>
     </w:p>
     <w:p>
@@ -62,7 +64,7 @@
         <w:pStyle w:val="ListBullet"/>
       </w:pPr>
       <w:r>
-        <w:t>Avoid pre approving the selected case. The recording should show a real local review decision or explicitly show that the case remains pending.</w:t>
+        <w:t>Leave review history off unless deliberately showing its consent and safe prose scope. Do not publish to GitHub during this demonstration; a local preview is enough to explain that separate capability.</w:t>
       </w:r>
     </w:p>
     <w:p>
@@ -70,17 +72,17 @@
         <w:pStyle w:val="Heading2"/>
       </w:pPr>
       <w:r>
-        <w:t>Suggested live input</w:t>
+        <w:t>Suggested input</w:t>
       </w:r>
     </w:p>
     <w:p>
       <w:r>
-        <w:t>My Streamlit CSV upload appears to reset after another widget changes. Investigate the documented rerun and session state behavior. Identify which version and minimal reproduction details are missing. Keep findings limited to what the saved sources directly support.</w:t>
+        <w:t>Statically review this small Python sample. Identify at most two claims supported by the registered code, distinguish observations from proposed checks, inspect relevant called helpers if related code is enabled, and pause for human review. Do not execute the sample or claim a reproduced failure.</w:t>
       </w:r>
     </w:p>
     <w:p>
       <w:r>
-        <w:t>Leave the version blank unless it is known. Add code only when it is the code actually being discussed. The run may choose different tools from a previous run; narrate observed events rather than promising a fixed sequence.</w:t>
+        <w:t>Use the actual 30-line freshness.py sample selected by evaluation/week3-cases.json. The verified saved fallback is case 8c857321-9d0f-414f-a811-d291947bc391; it has observed playbook and Bandit calls and remains pending human review. Enable related application code only when relevant and understood. Never claim a tool ran until the timeline shows it.</w:t>
       </w:r>
     </w:p>
     <w:p>
@@ -99,7 +101,7 @@
         <w:t>Screen cue:</w:t>
       </w:r>
       <w:r>
-        <w:t xml:space="preserve"> Show the issue workspace, then the Deep Investigation tab.</w:t>
+        <w:t xml:space="preserve"> Show the app and Deep Investigation tab.</w:t>
       </w:r>
     </w:p>
     <w:p>
@@ -110,7 +112,7 @@
         <w:t>Narration:</w:t>
       </w:r>
       <w:r>
-        <w:t xml:space="preserve"> Engineering Issue Desk helps a developer investigate a Streamlit issue and prepare a report for review. Week 3 adds an agent that chooses research steps and can delegate specialist work. The engineer still decides whether the evidence supports the proposed conclusion.</w:t>
+        <w:t xml:space="preserve"> Engineering Issue Desk helps an engineer investigate a Streamlit issue or review a small code sample. The agent chooses research steps and can delegate, while the application preserves evidence and pauses for a human decision.</w:t>
       </w:r>
     </w:p>
     <w:p>
@@ -129,7 +131,7 @@
         <w:t>Screen cue:</w:t>
       </w:r>
       <w:r>
-        <w:t xml:space="preserve"> Enter the suggested issue and start a genuine investigation. Keep the status panel visible.</w:t>
+        <w:t xml:space="preserve"> Supply the sample, show default-off options and start a real investigation. Keep progress visible.</w:t>
       </w:r>
     </w:p>
     <w:p>
@@ -140,7 +142,7 @@
         <w:t>Narration:</w:t>
       </w:r>
       <w:r>
-        <w:t xml:space="preserve"> The report starts an investigation rather than a single answer call. Fireworks powers the model, and Keenable supplies current public research when needed. The local knowledge base and public GitHub readers are also available. This run saves its sources and progress as it works.</w:t>
+        <w:t xml:space="preserve"> Fireworks powers the investigator. Keenable and public GitHub readers are available when research needs them. Related repository code and prior reviewed guidance require explicit opt-in. This run records its actual tool calls, sources, and usage; it does not execute the supplied program.</w:t>
       </w:r>
     </w:p>
     <w:p>
@@ -149,7 +151,7 @@
         <w:pageBreakBefore/>
       </w:pPr>
       <w:r>
-        <w:t>Show the investigation and evidence</w:t>
+        <w:t>Show tool use and evidence</w:t>
       </w:r>
     </w:p>
     <w:p>
@@ -157,7 +159,7 @@
         <w:pStyle w:val="Heading2"/>
       </w:pPr>
       <w:r>
-        <w:t>1 minute 5 seconds through 2 minutes 15 seconds</w:t>
+        <w:t>1 minute 5 seconds through 2 minutes 5 seconds</w:t>
       </w:r>
     </w:p>
     <w:p>
@@ -168,7 +170,7 @@
         <w:t>Screen cue:</w:t>
       </w:r>
       <w:r>
-        <w:t xml:space="preserve"> Show the live plan and completed tool events. Briefly open the architecture diagram while the run continues.</w:t>
+        <w:t xml:space="preserve"> Show observed plan or tool events, then open the Project guide architecture while the run continues.</w:t>
       </w:r>
     </w:p>
     <w:p>
@@ -179,7 +181,7 @@
         <w:t>Narration:</w:t>
       </w:r>
       <w:r>
-        <w:t xml:space="preserve"> Deep Agents decides what to read next. It can ask documentation research, correctness and security, or test and reproduction specialists for help. Each role shares the same case evidence and usage allowance. LangGraph saves the research state and pauses for human review. The tools read public information; they do not execute my code or publish a GitHub issue. If a tool fails, that failure is recorded and the agent must use other evidence or say what is missing.</w:t>
+        <w:t xml:space="preserve"> Deep Agents can load maintained playbooks, inspect bounded sources, and ask specialists for help. Fixed Bandit checks can parse registered Python code, but a static flag is not a verified vulnerability. The roles share one budget and source registry. LangGraph checkpoints preserve unfinished work and the human review interrupt.</w:t>
       </w:r>
     </w:p>
     <w:p>
@@ -187,7 +189,7 @@
         <w:pStyle w:val="Heading2"/>
       </w:pPr>
       <w:r>
-        <w:t>2 minutes 15 seconds through 3 minutes 25 seconds</w:t>
+        <w:t>2 minutes 5 seconds through 3 minutes 15 seconds</w:t>
       </w:r>
     </w:p>
     <w:p>
@@ -198,7 +200,7 @@
         <w:t>Screen cue:</w:t>
       </w:r>
       <w:r>
-        <w:t xml:space="preserve"> Open the resulting report and one source record. Show a finding, its exact quote, and provenance. If the live run is still working, use the fallback below.</w:t>
+        <w:t xml:space="preserve"> Open one report finding and its saved source, quote ID, line range/hash or dated provenance.</w:t>
       </w:r>
     </w:p>
     <w:p>
@@ -209,7 +211,7 @@
         <w:t>Narration:</w:t>
       </w:r>
       <w:r>
-        <w:t xml:space="preserve"> The application assigns quote IDs to saved source passages. The model selects those IDs, and the application supplies the original text. This prevents a paraphrase from being presented as an exact quotation. A separate model check reviews whether the evidence supports each finding before the report reaches human review. That extra check can still make mistakes. I inspect the actual passage, its date and version scope, and whether it just reports a public symptom or establishes documented behavior.</w:t>
+        <w:t xml:space="preserve"> The model selects a saved source and quote ID, and Python supplies the exact original passage. A separate evidence reviewer can remove unsupported content before the handoff. Both checks have limits: an exact quotation can support the wrong causal conclusion, and an AI reviewer can miss that error. I check what the code actually shows and what it leaves unknown.</w:t>
       </w:r>
     </w:p>
     <w:p>
@@ -217,12 +219,17 @@
         <w:pStyle w:val="Heading2"/>
       </w:pPr>
       <w:r>
-        <w:t>If the provider run is slow</w:t>
+        <w:t>If the live run is slow or fails</w:t>
       </w:r>
     </w:p>
     <w:p>
       <w:r>
-        <w:t>Say: This live investigation is still running. I will open a previously completed real case to demonstrate the report and review steps; its recorded events show what actually happened. Switch visibly to that saved case. Do not imply its result belongs to the new run or remove evidence of an error to suggest a successful run.</w:t>
+        <w:t>Say: This new investigation is still running, or failed at the recorded step. I will visibly open a previously saved real case to demonstrate the final report and review controls. Its case ID and timeline identify the earlier run. Do not present its result as the new run or conceal the failure.</w:t>
+      </w:r>
+    </w:p>
+    <w:p>
+      <w:r>
+        <w:t>Explain that explicit retry resumes pending work without refunding calls. Invalid completed reports can use a fresh repair thread with the same evidence and allowance. Show only sanitized diagnostics; do not narrate raw provider output.</w:t>
       </w:r>
     </w:p>
     <w:p>
@@ -230,17 +237,12 @@
         <w:pStyle w:val="Heading2"/>
       </w:pPr>
       <w:r>
-        <w:t>If a tool or model fails</w:t>
+        <w:t>Stretch features in one sentence</w:t>
       </w:r>
     </w:p>
     <w:p>
       <w:r>
-        <w:t>Show the saved failure and its recorded steps. Explain that retry resumes an unfinished checkpoint, while invalid completed reports can use a separate repair conversation with the same case evidence and cumulative limits. Demonstrate a retry only if the remaining recording time permits it; otherwise show a real saved case for the review interaction.</w:t>
-      </w:r>
-    </w:p>
-    <w:p>
-      <w:r>
-        <w:t>Do not read raw provider content or private code aloud. A sanitized error and the visible saved timeline are enough to demonstrate the recovery behavior.</w:t>
+        <w:t>Playbooks supply maintained procedures, optional review memory supplies noncitable local guidance, Bandit supplies attributed static flags, and an approved-case publication preview requires another explicit confirmation. These are stretch options, not an official extra-credit checklist. Show only features actually present in the final build.</w:t>
       </w:r>
     </w:p>
     <w:p>
@@ -249,7 +251,7 @@
         <w:pageBreakBefore/>
       </w:pPr>
       <w:r>
-        <w:t>Complete human review and close</w:t>
+        <w:t>Review and report the measured result</w:t>
       </w:r>
     </w:p>
     <w:p>
@@ -257,7 +259,7 @@
         <w:pStyle w:val="Heading2"/>
       </w:pPr>
       <w:r>
-        <w:t>3 minutes 25 seconds through 4 minutes 20 seconds</w:t>
+        <w:t>3 minutes 15 seconds through 4 minutes 10 seconds</w:t>
       </w:r>
     </w:p>
     <w:p>
@@ -268,7 +270,7 @@
         <w:t>Screen cue:</w:t>
       </w:r>
       <w:r>
-        <w:t xml:space="preserve"> Show missing information and proposed checks. Enter a genuine review note and approve or reject, or request a revision if the report needs correction. Reopen the saved case.</w:t>
+        <w:t xml:space="preserve"> Inspect proposed checks and missing details, enter a genuine note, then choose a decision appropriate to the evidence. Reopen the case.</w:t>
       </w:r>
     </w:p>
     <w:p>
@@ -279,7 +281,7 @@
         <w:t>Narration:</w:t>
       </w:r>
       <w:r>
-        <w:t xml:space="preserve"> The proposed checks are not tests that this agent has executed. I can approve the local report, reject it, or request a revision with notes. Approval and rejection do not rerun the investigator and do not post anything externally. The case remains available after a restart, with its evidence and review decision. A revision gets the prior report and my feedback so it can address the specific problem. Persistent case state is implemented; Mem0 based recall across cases is future work.</w:t>
+        <w:t xml:space="preserve"> These proposed tests have not been executed by the agent. I can approve the local report, reject it, or request a revision with notes and the prior report. Approval and rejection make no investigator call. A GitHub summary would need a separate preview, exact plan confirmation, and unchanged commits. This demonstration makes no external post. Saved checkpoints and optional local literal history are implemented; Mem0 is not.</w:t>
       </w:r>
     </w:p>
     <w:p>
@@ -287,7 +289,7 @@
         <w:pStyle w:val="Heading2"/>
       </w:pPr>
       <w:r>
-        <w:t>4 minutes 20 seconds through 4 minutes 45 seconds</w:t>
+        <w:t>4 minutes 10 seconds through 4 minutes 45 seconds</w:t>
       </w:r>
     </w:p>
     <w:p>
@@ -298,7 +300,7 @@
         <w:t>Screen cue:</w:t>
       </w:r>
       <w:r>
-        <w:t xml:space="preserve"> Show the recorded evaluation summary and the repository or writeup title.</w:t>
+        <w:t xml:space="preserve"> Select the exact latest recorded evaluation path, then show the repository and final writeup title.</w:t>
       </w:r>
     </w:p>
     <w:p>
@@ -309,7 +311,7 @@
         <w:t>Narration:</w:t>
       </w:r>
       <w:r>
-        <w:t xml:space="preserve"> Codex helped implement and test the tool loop, saved review, and failure recovery. Live testing led to quote IDs and a separate evidence check. That AI check still missed an incorrect recommendation, so human review remains essential. Automated tests verify workflow behavior; the quality target needs human evaluation.</w:t>
+        <w:t xml:space="preserve"> Codex helped build and test the tool loop, state, and error recovery. Observed failures led to quote IDs, a separate evidence audit, and tighter context and budget rules. The recorded handoffs show workflow completion on these samples. Human usefulness and accuracy remain unmeasured, and the third sample did not establish a defect.</w:t>
       </w:r>
     </w:p>
     <w:p>
@@ -317,12 +319,12 @@
         <w:pStyle w:val="Heading2"/>
       </w:pPr>
       <w:r>
-        <w:t>Evidence to mention accurately</w:t>
+        <w:t>Numbers to read accurately</w:t>
       </w:r>
     </w:p>
     <w:p>
       <w:r>
-        <w:t>The current regression suite contains 401 passing tests. Provider connectivity was verified with a Fireworks tool round trip and a Keenable search. Describe the recorded case outcomes below as handoffs pending human judgment; AI review does not establish human accuracy.</w:t>
+        <w:t>The final offline suite passed 603 tests. The latest run saved 3 of 3 handoffs with 0 failures, 12 model calls, 6 tools, and 70,003 reported tokens with complete usage. AI review removed 4 findings and 3 proposed steps. Exact-citation checks apply to retained factual findings; empty reports are not applicable, not accuracy successes. Human quality remains unscored.</w:t>
       </w:r>
     </w:p>
     <w:tbl>
@@ -405,7 +407,7 @@
                 <w:color w:val="000000"/>
                 <w:sz w:val="20"/>
               </w:rPr>
-              <w:t>Result to describe</w:t>
+              <w:t>Observed state</w:t>
             </w:r>
           </w:p>
         </w:tc>
@@ -476,7 +478,7 @@
                 <w:color w:val="000000"/>
                 <w:sz w:val="20"/>
               </w:rPr>
-              <w:t>Awaiting human review; 3 model calls; 1 tool call; 13,888 reported tokens; 1 retained finding</w:t>
+              <w:t>Awaiting human review; 3 model calls; 1 tool call; 14,705 reported tokens; 0 retained findings</w:t>
             </w:r>
           </w:p>
         </w:tc>
@@ -547,7 +549,7 @@
                 <w:color w:val="000000"/>
                 <w:sz w:val="20"/>
               </w:rPr>
-              <w:t>failed; 3 model calls; 1 tool call; 13,555 reported tokens; 2 draft findings</w:t>
+              <w:t>Awaiting human review; 3 model calls; 1 tool call; 14,724 reported tokens; 2 retained findings</w:t>
             </w:r>
           </w:p>
         </w:tc>
@@ -618,7 +620,7 @@
                 <w:color w:val="000000"/>
                 <w:sz w:val="20"/>
               </w:rPr>
-              <w:t>Awaiting human review; 3 model calls; 1 tool call; 16,939 reported tokens; 2 retained findings</w:t>
+              <w:t>Awaiting human review; 6 model calls; 4 tool calls; 40,574 reported tokens; 0 retained findings</w:t>
             </w:r>
           </w:p>
         </w:tc>
@@ -639,32 +641,8 @@
       </w:r>
     </w:p>
     <w:p>
-      <w:pPr>
-        <w:pStyle w:val="ListBullet"/>
-      </w:pPr>
       <w:r>
-        <w:t>Check that the finished video is five minutes or less, readable, audible, and free of credentials.</w:t>
-      </w:r>
-    </w:p>
-    <w:p>
-      <w:pPr>
-        <w:pStyle w:val="ListBullet"/>
-      </w:pPr>
-      <w:r>
-        <w:t>Attach the native Google Doc, the recorded video link, and the pushed GitHub code link to the submission form.</w:t>
-      </w:r>
-    </w:p>
-    <w:p>
-      <w:pPr>
-        <w:pStyle w:val="ListBullet"/>
-      </w:pPr>
-      <w:r>
-        <w:t>Confirm link access from the intended reviewer account. Builder consideration closes October 25 2026; certification closes November 11 2026.</w:t>
-      </w:r>
-    </w:p>
-    <w:p>
-      <w:r>
-        <w:t>The video recording and final Week 3 GitHub push are outstanding actions. This guide does not mark either action complete.</w:t>
+        <w:t>Check that the finished video is five minutes or less, readable, audible, and free of private content. Confirm the final native Google Doc and public repository open for reviewers, check CI for the pushed commit, and submit those links plus the video through the course form. Builder eligibility ends October 25 2026; certification ends November 11 2026. This guide does not mark recording or submission complete.</w:t>
       </w:r>
     </w:p>
     <w:sectPr>

</xml_diff>

<commit_message>
Refetch the knowledge snapshot and make weekly refresh explicit
</commit_message>
<xml_diff>
--- a/docs/Engineering Issue Desk Week 3 Demo Guide.docx
+++ b/docs/Engineering Issue Desk Week 3 Demo Guide.docx
@@ -48,7 +48,7 @@
         <w:pStyle w:val="ListBullet"/>
       </w:pPr>
       <w:r>
-        <w:t>Open the current evaluation JSON by its explicit path and the Project guide diagram. The October 17 corpus is a dated snapshot; acknowledge any age warning.</w:t>
+        <w:t>Open the evaluation JSON and Project guide diagram. Show the sidebar refresh date and actual oldest age: all 65 workspace sources were refetched October 25 Pacific. The frozen agent runs used the October 17 snapshot.</w:t>
       </w:r>
     </w:p>
     <w:p>
@@ -324,7 +324,7 @@
     </w:p>
     <w:p>
       <w:r>
-        <w:t>The final offline suite passed 603 tests. The latest run saved 3 of 3 handoffs with 0 failures, 12 model calls, 6 tools, and 70,003 reported tokens with complete usage. AI review removed 4 findings and 3 proposed steps. Exact-citation checks apply to retained factual findings; empty reports are not applicable, not accuracy successes. Human quality remains unscored.</w:t>
+        <w:t>The final offline suite passed 615 tests. The latest run saved 3 of 3 handoffs with 0 failures, 12 model calls, 6 tools, and 70,003 reported tokens with complete usage. AI review removed 4 findings and 3 proposed steps. Exact-citation checks apply to retained factual findings; empty reports are not applicable, not accuracy successes. Human quality remains unscored.</w:t>
       </w:r>
     </w:p>
     <w:tbl>

</xml_diff>